<commit_message>
docs: the spec gets a release log, so production and the doc move together
Part 3 — Release Notes: a dated, dual-audience log (one 'for product' line,
one 'under the hood' line, plus which §§ were updated) that every deploy
touching the pipeline must append to — Edge Function deploys, Apps Script
pastes, pipeline-table migrations, capture/review client changes. The
contract is entry + section edits + regenerated .docx in the same commit as
the deploy.

Seeded with the real spine: today's v24 + 0101–0103 incident batch, the
spec's own publication, 0090 tombstones, and the 2026-08-25 consent-v4 /
unmasked-model / in-house-connect change. CLAUDE.md pointer table gains the
row so every session finds the rule.

Co-Authored-By: Claude Fable 5 <noreply@anthropic.com>
</commit_message>
<xml_diff>
--- a/docs/specs/effortless-transaction-logging-spec.docx
+++ b/docs/specs/effortless-transaction-logging-spec.docx
@@ -106,7 +106,22 @@
           <w:color w:val="5C6B63"/>
           <w:sz w:val="21"/>
         </w:rPr>
-        <w:t xml:space="preserve"> Part 1 (Behaviour) is for everyone — product, design, QA, onboarding. Part 2 (Technical Appendix) is for engineers. The transports table is the one-glance summary; the three diagrams are the zoom-out views.</w:t>
+        <w:t xml:space="preserve"> Part 1 (Behaviour) is for everyone — product, design, QA, onboarding. Part 2 (Technical Appendix) is for engineers. Part 3 (Release Notes) is the running log of every deployment that changed what this document describes — </w:t>
+      </w:r>
+      <w:r>
+        <w:rPr>
+          <w:b/>
+          <w:color w:val="5C6B63"/>
+          <w:sz w:val="21"/>
+        </w:rPr>
+        <w:t>check it first if the doc and production seem to disagree</w:t>
+      </w:r>
+      <w:r>
+        <w:rPr>
+          <w:color w:val="5C6B63"/>
+          <w:sz w:val="21"/>
+        </w:rPr>
+        <w:t>. The transports table is the one-glance summary; the four diagrams are the zoom-out views.</w:t>
       </w:r>
     </w:p>
     <w:p>
@@ -29012,6 +29027,1084 @@
       <w:r>
         <w:rPr/>
         <w:t xml:space="preserve"> — cross-session ground rules and live claims.</w:t>
+      </w:r>
+    </w:p>
+    <w:p>
+      <w:pPr>
+        <w:pStyle w:val="Heading1"/>
+      </w:pPr>
+      <w:r>
+        <w:rPr>
+          <w:b/>
+          <w:sz w:val="38"/>
+        </w:rPr>
+        <w:t>Part 3 — Release Notes</w:t>
+      </w:r>
+    </w:p>
+    <w:p>
+      <w:r>
+        <w:rPr/>
+        <w:t>The running log of every deployment that changed what this document describes. This part exists so the spec is never quietly wrong: production and the doc move together, and anyone — product, engineering, or a Claude session picking up the repo cold — can trust the newest entry as the current state of the world.</w:t>
+      </w:r>
+    </w:p>
+    <w:p>
+      <w:pPr>
+        <w:pStyle w:val="Heading2"/>
+      </w:pPr>
+      <w:r>
+        <w:rPr>
+          <w:b/>
+          <w:sz w:val="28"/>
+        </w:rPr>
+        <w:t>27. How this part works</w:t>
+      </w:r>
+    </w:p>
+    <w:p>
+      <w:r>
+        <w:rPr>
+          <w:b/>
+        </w:rPr>
+        <w:t>When to add an entry — any of these ships:</w:t>
+      </w:r>
+    </w:p>
+    <w:p>
+      <w:pPr>
+        <w:pStyle w:val="ListBullet"/>
+      </w:pPr>
+      <w:r>
+        <w:rPr/>
+        <w:t xml:space="preserve">an Edge Function deploy of </w:t>
+      </w:r>
+      <w:r>
+        <w:rPr>
+          <w:rFonts w:ascii="Consolas" w:hAnsi="Consolas"/>
+          <w:b w:val="0"/>
+          <w:color w:val="2A4A3A"/>
+          <w:sz w:val="20"/>
+        </w:rPr>
+        <w:t>mailbox-sync</w:t>
+      </w:r>
+      <w:r>
+        <w:rPr/>
+        <w:t xml:space="preserve">, </w:t>
+      </w:r>
+      <w:r>
+        <w:rPr>
+          <w:rFonts w:ascii="Consolas" w:hAnsi="Consolas"/>
+          <w:b w:val="0"/>
+          <w:color w:val="2A4A3A"/>
+          <w:sz w:val="20"/>
+        </w:rPr>
+        <w:t>mailbox-connect</w:t>
+      </w:r>
+      <w:r>
+        <w:rPr/>
+        <w:t xml:space="preserve">, or </w:t>
+      </w:r>
+      <w:r>
+        <w:rPr>
+          <w:rFonts w:ascii="Consolas" w:hAnsi="Consolas"/>
+          <w:b w:val="0"/>
+          <w:color w:val="2A4A3A"/>
+          <w:sz w:val="20"/>
+        </w:rPr>
+        <w:t>push-send</w:t>
+      </w:r>
+    </w:p>
+    <w:p>
+      <w:pPr>
+        <w:pStyle w:val="ListBullet"/>
+      </w:pPr>
+      <w:r>
+        <w:rPr/>
+        <w:t xml:space="preserve">an Apps Script paste (a </w:t>
+      </w:r>
+      <w:r>
+        <w:rPr>
+          <w:rFonts w:ascii="Consolas" w:hAnsi="Consolas"/>
+          <w:b w:val="0"/>
+          <w:color w:val="2A4A3A"/>
+          <w:sz w:val="20"/>
+        </w:rPr>
+        <w:t>PIPELINE_VERSION</w:t>
+      </w:r>
+      <w:r>
+        <w:rPr/>
+        <w:t xml:space="preserve"> bump)</w:t>
+      </w:r>
+    </w:p>
+    <w:p>
+      <w:pPr>
+        <w:pStyle w:val="ListBullet"/>
+      </w:pPr>
+      <w:r>
+        <w:rPr/>
+        <w:t>an applied migration touching the pipeline's tables (</w:t>
+      </w:r>
+      <w:r>
+        <w:rPr>
+          <w:rFonts w:ascii="Consolas" w:hAnsi="Consolas"/>
+          <w:b w:val="0"/>
+          <w:color w:val="2A4A3A"/>
+          <w:sz w:val="20"/>
+        </w:rPr>
+        <w:t>email_transactions</w:t>
+      </w:r>
+      <w:r>
+        <w:rPr/>
+        <w:t xml:space="preserve">, </w:t>
+      </w:r>
+      <w:r>
+        <w:rPr>
+          <w:rFonts w:ascii="Consolas" w:hAnsi="Consolas"/>
+          <w:b w:val="0"/>
+          <w:color w:val="2A4A3A"/>
+          <w:sz w:val="20"/>
+        </w:rPr>
+        <w:t>mailbox_grants</w:t>
+      </w:r>
+      <w:r>
+        <w:rPr/>
+        <w:t xml:space="preserve">, </w:t>
+      </w:r>
+      <w:r>
+        <w:rPr>
+          <w:rFonts w:ascii="Consolas" w:hAnsi="Consolas"/>
+          <w:b w:val="0"/>
+          <w:color w:val="2A4A3A"/>
+          <w:sz w:val="20"/>
+        </w:rPr>
+        <w:t>sender_fingerprints</w:t>
+      </w:r>
+      <w:r>
+        <w:rPr/>
+        <w:t xml:space="preserve">, </w:t>
+      </w:r>
+      <w:r>
+        <w:rPr>
+          <w:rFonts w:ascii="Consolas" w:hAnsi="Consolas"/>
+          <w:b w:val="0"/>
+          <w:color w:val="2A4A3A"/>
+          <w:sz w:val="20"/>
+        </w:rPr>
+        <w:t>resolved_email_messages</w:t>
+      </w:r>
+      <w:r>
+        <w:rPr/>
+        <w:t xml:space="preserve">, </w:t>
+      </w:r>
+      <w:r>
+        <w:rPr>
+          <w:rFonts w:ascii="Consolas" w:hAnsi="Consolas"/>
+          <w:b w:val="0"/>
+          <w:color w:val="2A4A3A"/>
+          <w:sz w:val="20"/>
+        </w:rPr>
+        <w:t>parse_failures</w:t>
+      </w:r>
+      <w:r>
+        <w:rPr/>
+        <w:t>, staging keys, tallies)</w:t>
+      </w:r>
+    </w:p>
+    <w:p>
+      <w:pPr>
+        <w:pStyle w:val="ListBullet"/>
+      </w:pPr>
+      <w:r>
+        <w:rPr/>
+        <w:t>a client release changing capture, review, or promotion behaviour</w:t>
+      </w:r>
+    </w:p>
+    <w:p>
+      <w:pPr>
+        <w:pStyle w:val="ListBullet"/>
+      </w:pPr>
+      <w:r>
+        <w:rPr/>
+        <w:t xml:space="preserve">transport C going live, or its </w:t>
+      </w:r>
+      <w:r>
+        <w:rPr>
+          <w:rFonts w:ascii="Consolas" w:hAnsi="Consolas"/>
+          <w:b w:val="0"/>
+          <w:color w:val="2A4A3A"/>
+          <w:sz w:val="20"/>
+        </w:rPr>
+        <w:t>/ingest</w:t>
+      </w:r>
+      <w:r>
+        <w:rPr/>
+        <w:t xml:space="preserve"> bridge merging</w:t>
+      </w:r>
+    </w:p>
+    <w:p>
+      <w:r>
+        <w:rPr>
+          <w:b/>
+        </w:rPr>
+        <w:t>How to write one.</w:t>
+      </w:r>
+      <w:r>
+        <w:rPr/>
+        <w:t xml:space="preserve"> Newest first. Every entry carries four lines, so both audiences can pick it up without the other's context:</w:t>
+      </w:r>
+    </w:p>
+    <w:p>
+      <w:pPr>
+        <w:pStyle w:val="ListBullet"/>
+      </w:pPr>
+      <w:r>
+        <w:rPr>
+          <w:b/>
+        </w:rPr>
+        <w:t>For product</w:t>
+      </w:r>
+      <w:r>
+        <w:rPr/>
+        <w:t xml:space="preserve"> — what a user or the team can now see/do differently, in plain words. No function names.</w:t>
+      </w:r>
+    </w:p>
+    <w:p>
+      <w:pPr>
+        <w:pStyle w:val="ListBullet"/>
+      </w:pPr>
+      <w:r>
+        <w:rPr>
+          <w:b/>
+        </w:rPr>
+        <w:t>Under the hood</w:t>
+      </w:r>
+      <w:r>
+        <w:rPr/>
+        <w:t xml:space="preserve"> — what actually changed, precise enough for an engineer to find it: components + versions, migrations, constants, commit hashes.</w:t>
+      </w:r>
+    </w:p>
+    <w:p>
+      <w:pPr>
+        <w:pStyle w:val="ListBullet"/>
+      </w:pPr>
+      <w:r>
+        <w:rPr>
+          <w:b/>
+        </w:rPr>
+        <w:t>Spec sections updated</w:t>
+      </w:r>
+      <w:r>
+        <w:rPr/>
+        <w:t xml:space="preserve"> — which §§ of this document were edited to match. </w:t>
+      </w:r>
+      <w:r>
+        <w:rPr>
+          <w:i/>
+        </w:rPr>
+        <w:t>An entry with nothing here and a behaviour change is a red flag — either the doc already covered it or the update was skipped.</w:t>
+      </w:r>
+    </w:p>
+    <w:p>
+      <w:pPr>
+        <w:pStyle w:val="ListBullet"/>
+      </w:pPr>
+      <w:r>
+        <w:rPr>
+          <w:b/>
+        </w:rPr>
+        <w:t>Watch for</w:t>
+      </w:r>
+      <w:r>
+        <w:rPr/>
+        <w:t xml:space="preserve"> </w:t>
+      </w:r>
+      <w:r>
+        <w:rPr>
+          <w:i/>
+        </w:rPr>
+        <w:t>(optional)</w:t>
+      </w:r>
+      <w:r>
+        <w:rPr/>
+        <w:t xml:space="preserve"> — what to monitor after this deploy, or what it deliberately does not fix.</w:t>
+      </w:r>
+    </w:p>
+    <w:p>
+      <w:r>
+        <w:rPr>
+          <w:b/>
+        </w:rPr>
+        <w:t>The contract:</w:t>
+      </w:r>
+      <w:r>
+        <w:rPr/>
+        <w:t xml:space="preserve"> the entry, the section edits, and the regenerated </w:t>
+      </w:r>
+      <w:r>
+        <w:rPr>
+          <w:rFonts w:ascii="Consolas" w:hAnsi="Consolas"/>
+          <w:b w:val="0"/>
+          <w:color w:val="2A4A3A"/>
+          <w:sz w:val="20"/>
+        </w:rPr>
+        <w:t>.docx</w:t>
+      </w:r>
+      <w:r>
+        <w:rPr/>
+        <w:t xml:space="preserve"> (</w:t>
+      </w:r>
+      <w:r>
+        <w:rPr>
+          <w:rFonts w:ascii="Consolas" w:hAnsi="Consolas"/>
+          <w:b w:val="0"/>
+          <w:color w:val="2A4A3A"/>
+          <w:sz w:val="20"/>
+        </w:rPr>
+        <w:t>build-effortless-transaction-logging-spec.py</w:t>
+      </w:r>
+      <w:r>
+        <w:rPr/>
+        <w:t xml:space="preserve">; diagrams via </w:t>
+      </w:r>
+      <w:r>
+        <w:rPr>
+          <w:rFonts w:ascii="Consolas" w:hAnsi="Consolas"/>
+          <w:b w:val="0"/>
+          <w:color w:val="2A4A3A"/>
+          <w:sz w:val="20"/>
+        </w:rPr>
+        <w:t>build-effortless-diagrams.py</w:t>
+      </w:r>
+      <w:r>
+        <w:rPr/>
+        <w:t xml:space="preserve"> if they changed) land in the </w:t>
+      </w:r>
+      <w:r>
+        <w:rPr>
+          <w:b/>
+        </w:rPr>
+        <w:t>same commit</w:t>
+      </w:r>
+      <w:r>
+        <w:rPr/>
+        <w:t xml:space="preserve"> as — or the same day as — the deploy. A deploy announced only in </w:t>
+      </w:r>
+      <w:r>
+        <w:rPr>
+          <w:rFonts w:ascii="Consolas" w:hAnsi="Consolas"/>
+          <w:b w:val="0"/>
+          <w:color w:val="2A4A3A"/>
+          <w:sz w:val="20"/>
+        </w:rPr>
+        <w:t>AGENT_SYNC.md</w:t>
+      </w:r>
+      <w:r>
+        <w:rPr/>
+        <w:t xml:space="preserve"> is coordination; this is the record.</w:t>
+      </w:r>
+    </w:p>
+    <w:p>
+      <w:pPr>
+        <w:pStyle w:val="Heading2"/>
+      </w:pPr>
+      <w:r>
+        <w:rPr>
+          <w:b/>
+          <w:sz w:val="28"/>
+        </w:rPr>
+        <w:t>28. Releases (newest first)</w:t>
+      </w:r>
+    </w:p>
+    <w:p>
+      <w:pPr>
+        <w:pStyle w:val="Heading3"/>
+      </w:pPr>
+      <w:r>
+        <w:rPr>
+          <w:b/>
+          <w:sz w:val="23"/>
+        </w:rPr>
+        <w:t>2026-08-30 — mailbox-sync v24 · migrations 0101–0103 — the first-real-user backfill incident</w:t>
+      </w:r>
+    </w:p>
+    <w:p>
+      <w:pPr>
+        <w:pStyle w:val="ListBullet"/>
+      </w:pPr>
+      <w:r>
+        <w:rPr>
+          <w:b/>
+        </w:rPr>
+        <w:t>For product:</w:t>
+      </w:r>
+      <w:r>
+        <w:rPr/>
+        <w:t xml:space="preserve"> the three symptoms of the first outside-team mailbox connect are fixed: the notification-every-minute storm (60/hour) has stopped; VCB card rows no longer arrive titled "At" or with a bank-footer sentence as the merchant; and a 365-day first read now actually stages instead of showing nothing for hours. Backfills are also much faster (a 90-day history in ~76s) and buzz once, not once per chunk. Known remainder: a backfill whose tail is all junk mail still never marks itself finished and re-reads that tail every minute (§24) — queue-healing for the affected account and the completion fix are planned, not shipped.</w:t>
+      </w:r>
+    </w:p>
+    <w:p>
+      <w:pPr>
+        <w:pStyle w:val="ListBullet"/>
+      </w:pPr>
+      <w:r>
+        <w:rPr>
+          <w:b/>
+        </w:rPr>
+        <w:t>Under the hood:</w:t>
+      </w:r>
+      <w:r>
+        <w:rPr/>
+        <w:t xml:space="preserve"> stall notice edge-triggered on the streak crossing instead of level-checked (</w:t>
+      </w:r>
+      <w:r>
+        <w:rPr>
+          <w:rFonts w:ascii="Consolas" w:hAnsi="Consolas"/>
+          <w:b w:val="0"/>
+          <w:color w:val="2A4A3A"/>
+          <w:sz w:val="20"/>
+        </w:rPr>
+        <w:t>53e826d</w:t>
+      </w:r>
+      <w:r>
+        <w:rPr/>
+        <w:t xml:space="preserve">; the level form fired on every fast-lane minute past 12 stalled runs); label-table reader skips bilingual English twin labels ("Sử dụng tại"/"At" split by </w:t>
+      </w:r>
+      <w:r>
+        <w:rPr>
+          <w:rFonts w:ascii="Consolas" w:hAnsi="Consolas"/>
+          <w:b w:val="0"/>
+          <w:color w:val="2A4A3A"/>
+          <w:sz w:val="20"/>
+        </w:rPr>
+        <w:t>&lt;br&gt;</w:t>
+      </w:r>
+      <w:r>
+        <w:rPr/>
+        <w:t xml:space="preserve"> — </w:t>
+      </w:r>
+      <w:r>
+        <w:rPr>
+          <w:rFonts w:ascii="Consolas" w:hAnsi="Consolas"/>
+          <w:b w:val="0"/>
+          <w:color w:val="2A4A3A"/>
+          <w:sz w:val="20"/>
+        </w:rPr>
+        <w:t>c2f6074</w:t>
+      </w:r>
+      <w:r>
+        <w:rPr/>
+        <w:t>) and no longer contains-matches labels inside footer prose (</w:t>
+      </w:r>
+      <w:r>
+        <w:rPr>
+          <w:rFonts w:ascii="Consolas" w:hAnsi="Consolas"/>
+          <w:b w:val="0"/>
+          <w:color w:val="2A4A3A"/>
+          <w:sz w:val="20"/>
+        </w:rPr>
+        <w:t>6ecd86a</w:t>
+      </w:r>
+      <w:r>
+        <w:rPr/>
+        <w:t xml:space="preserve">); </w:t>
+      </w:r>
+      <w:r>
+        <w:rPr>
+          <w:rFonts w:ascii="Consolas" w:hAnsi="Consolas"/>
+          <w:b w:val="0"/>
+          <w:color w:val="2A4A3A"/>
+          <w:sz w:val="20"/>
+        </w:rPr>
+        <w:t>alreadyStaged</w:t>
+      </w:r>
+      <w:r>
+        <w:rPr/>
+        <w:t xml:space="preserve"> chunked at 150 ids/request — 891 ids in one </w:t>
+      </w:r>
+      <w:r>
+        <w:rPr>
+          <w:rFonts w:ascii="Consolas" w:hAnsi="Consolas"/>
+          <w:b w:val="0"/>
+          <w:color w:val="2A4A3A"/>
+          <w:sz w:val="20"/>
+        </w:rPr>
+        <w:t>in.(…)</w:t>
+      </w:r>
+      <w:r>
+        <w:rPr/>
+        <w:t xml:space="preserve"> URL was ~19KB and Cloudflare refused it before anything ran (</w:t>
+      </w:r>
+      <w:r>
+        <w:rPr>
+          <w:rFonts w:ascii="Consolas" w:hAnsi="Consolas"/>
+          <w:b w:val="0"/>
+          <w:color w:val="2A4A3A"/>
+          <w:sz w:val="20"/>
+        </w:rPr>
+        <w:t>2b6ffad</w:t>
+      </w:r>
+      <w:r>
+        <w:rPr/>
+        <w:t>); model budget now per-grant (</w:t>
+      </w:r>
+      <w:r>
+        <w:rPr>
+          <w:rFonts w:ascii="Consolas" w:hAnsi="Consolas"/>
+          <w:b w:val="0"/>
+          <w:color w:val="2A4A3A"/>
+          <w:sz w:val="20"/>
+        </w:rPr>
+        <w:t>MAX_MODEL_CALLS_PER_GRANT = 40</w:t>
+      </w:r>
+      <w:r>
+        <w:rPr/>
+        <w:t xml:space="preserve">) instead of 10 pooled per run, </w:t>
+      </w:r>
+      <w:r>
+        <w:rPr>
+          <w:rFonts w:ascii="Consolas" w:hAnsi="Consolas"/>
+          <w:b w:val="0"/>
+          <w:color w:val="2A4A3A"/>
+          <w:sz w:val="20"/>
+        </w:rPr>
+        <w:t>BACKFILL_STAGE_MAX</w:t>
+      </w:r>
+      <w:r>
+        <w:rPr/>
+        <w:t xml:space="preserve"> 150→400, </w:t>
+      </w:r>
+      <w:r>
+        <w:rPr>
+          <w:rFonts w:ascii="Consolas" w:hAnsi="Consolas"/>
+          <w:b w:val="0"/>
+          <w:color w:val="2A4A3A"/>
+          <w:sz w:val="20"/>
+        </w:rPr>
+        <w:t>MAX_MESSAGES_PER_GRANT</w:t>
+      </w:r>
+      <w:r>
+        <w:rPr/>
+        <w:t xml:space="preserve"> 40→120, </w:t>
+      </w:r>
+      <w:r>
+        <w:rPr>
+          <w:rFonts w:ascii="Consolas" w:hAnsi="Consolas"/>
+          <w:b w:val="0"/>
+          <w:color w:val="2A4A3A"/>
+          <w:sz w:val="20"/>
+        </w:rPr>
+        <w:t>FETCH_CONCURRENCY</w:t>
+      </w:r>
+      <w:r>
+        <w:rPr/>
+        <w:t xml:space="preserve"> 6→20 (</w:t>
+      </w:r>
+      <w:r>
+        <w:rPr>
+          <w:rFonts w:ascii="Consolas" w:hAnsi="Consolas"/>
+          <w:b w:val="0"/>
+          <w:color w:val="2A4A3A"/>
+          <w:sz w:val="20"/>
+        </w:rPr>
+        <w:t>f699514</w:t>
+      </w:r>
+      <w:r>
+        <w:rPr/>
+        <w:t>); first-read notify moved to on-completion with a stall-counter fallback (</w:t>
+      </w:r>
+      <w:r>
+        <w:rPr>
+          <w:rFonts w:ascii="Consolas" w:hAnsi="Consolas"/>
+          <w:b w:val="0"/>
+          <w:color w:val="2A4A3A"/>
+          <w:sz w:val="20"/>
+        </w:rPr>
+        <w:t>9bd6295</w:t>
+      </w:r>
+      <w:r>
+        <w:rPr/>
+        <w:t xml:space="preserve">, </w:t>
+      </w:r>
+      <w:r>
+        <w:rPr>
+          <w:rFonts w:ascii="Consolas" w:hAnsi="Consolas"/>
+          <w:b w:val="0"/>
+          <w:color w:val="2A4A3A"/>
+          <w:sz w:val="20"/>
+        </w:rPr>
+        <w:t>0101</w:t>
+      </w:r>
+      <w:r>
+        <w:rPr/>
+        <w:t xml:space="preserve">); </w:t>
+      </w:r>
+      <w:r>
+        <w:rPr>
+          <w:rFonts w:ascii="Consolas" w:hAnsi="Consolas"/>
+          <w:b w:val="0"/>
+          <w:color w:val="2A4A3A"/>
+          <w:sz w:val="20"/>
+        </w:rPr>
+        <w:t>default_scope</w:t>
+      </w:r>
+      <w:r>
+        <w:rPr/>
+        <w:t xml:space="preserve"> added to the client column grant — its absence sent connected users back to setup (</w:t>
+      </w:r>
+      <w:r>
+        <w:rPr>
+          <w:rFonts w:ascii="Consolas" w:hAnsi="Consolas"/>
+          <w:b w:val="0"/>
+          <w:color w:val="2A4A3A"/>
+          <w:sz w:val="20"/>
+        </w:rPr>
+        <w:t>e341c9d</w:t>
+      </w:r>
+      <w:r>
+        <w:rPr/>
+        <w:t xml:space="preserve">, </w:t>
+      </w:r>
+      <w:r>
+        <w:rPr>
+          <w:rFonts w:ascii="Consolas" w:hAnsi="Consolas"/>
+          <w:b w:val="0"/>
+          <w:color w:val="2A4A3A"/>
+          <w:sz w:val="20"/>
+        </w:rPr>
+        <w:t>0102</w:t>
+      </w:r>
+      <w:r>
+        <w:rPr/>
+        <w:t>); one grant per fold-normalised mailbox address across accounts (</w:t>
+      </w:r>
+      <w:r>
+        <w:rPr>
+          <w:rFonts w:ascii="Consolas" w:hAnsi="Consolas"/>
+          <w:b w:val="0"/>
+          <w:color w:val="2A4A3A"/>
+          <w:sz w:val="20"/>
+        </w:rPr>
+        <w:t>a82ac66</w:t>
+      </w:r>
+      <w:r>
+        <w:rPr/>
+        <w:t xml:space="preserve">, </w:t>
+      </w:r>
+      <w:r>
+        <w:rPr>
+          <w:rFonts w:ascii="Consolas" w:hAnsi="Consolas"/>
+          <w:b w:val="0"/>
+          <w:color w:val="2A4A3A"/>
+          <w:sz w:val="20"/>
+        </w:rPr>
+        <w:t>0103</w:t>
+      </w:r>
+      <w:r>
+        <w:rPr/>
+        <w:t>).</w:t>
+      </w:r>
+    </w:p>
+    <w:p>
+      <w:pPr>
+        <w:pStyle w:val="ListBullet"/>
+      </w:pPr>
+      <w:r>
+        <w:rPr>
+          <w:b/>
+        </w:rPr>
+        <w:t>Spec sections updated:</w:t>
+      </w:r>
+      <w:r>
+        <w:rPr/>
+        <w:t xml:space="preserve"> §12.4, §14.3–14.4, §14.7, §16.1, §20, §21.5, §24, extraction-flow diagram.</w:t>
+      </w:r>
+    </w:p>
+    <w:p>
+      <w:pPr>
+        <w:pStyle w:val="ListBullet"/>
+      </w:pPr>
+      <w:r>
+        <w:rPr>
+          <w:b/>
+        </w:rPr>
+        <w:t>Watch for:</w:t>
+      </w:r>
+      <w:r>
+        <w:rPr/>
+        <w:t xml:space="preserve"> </w:t>
+      </w:r>
+      <w:r>
+        <w:rPr>
+          <w:rFonts w:ascii="Consolas" w:hAnsi="Consolas"/>
+          <w:b w:val="0"/>
+          <w:color w:val="2A4A3A"/>
+          <w:sz w:val="20"/>
+        </w:rPr>
+        <w:t>read_tally.junk_cache</w:t>
+      </w:r>
+      <w:r>
+        <w:rPr/>
+        <w:t xml:space="preserve"> exploding and </w:t>
+      </w:r>
+      <w:r>
+        <w:rPr>
+          <w:rFonts w:ascii="Consolas" w:hAnsi="Consolas"/>
+          <w:b w:val="0"/>
+          <w:color w:val="2A4A3A"/>
+          <w:sz w:val="20"/>
+        </w:rPr>
+        <w:t>backfilled_at</w:t>
+      </w:r>
+      <w:r>
+        <w:rPr/>
+        <w:t xml:space="preserve"> stuck null with a cycling stall streak — that is the §24 wedge, still open. Occasional single stall notices (one per streak re-crossing) are the designed behaviour until it lands.</w:t>
+      </w:r>
+    </w:p>
+    <w:p>
+      <w:pPr>
+        <w:pStyle w:val="Heading3"/>
+      </w:pPr>
+      <w:r>
+        <w:rPr>
+          <w:b/>
+          <w:sz w:val="23"/>
+        </w:rPr>
+        <w:t>2026-08-29 — this specification first published</w:t>
+      </w:r>
+    </w:p>
+    <w:p>
+      <w:pPr>
+        <w:pStyle w:val="ListBullet"/>
+      </w:pPr>
+      <w:r>
+        <w:rPr>
+          <w:b/>
+        </w:rPr>
+        <w:t>For product:</w:t>
+      </w:r>
+      <w:r>
+        <w:rPr/>
+        <w:t xml:space="preserve"> the feature has a single end-to-end source of truth; earlier partial docs (</w:t>
+      </w:r>
+      <w:r>
+        <w:rPr>
+          <w:rFonts w:ascii="Consolas" w:hAnsi="Consolas"/>
+          <w:b w:val="0"/>
+          <w:color w:val="2A4A3A"/>
+          <w:sz w:val="20"/>
+        </w:rPr>
+        <w:t>bank-email-capture-spec.docx</w:t>
+      </w:r>
+      <w:r>
+        <w:rPr/>
+        <w:t xml:space="preserve">, </w:t>
+      </w:r>
+      <w:r>
+        <w:rPr>
+          <w:rFonts w:ascii="Consolas" w:hAnsi="Consolas"/>
+          <w:b w:val="0"/>
+          <w:color w:val="2A4A3A"/>
+          <w:sz w:val="20"/>
+        </w:rPr>
+        <w:t>transaction-review-spec.md</w:t>
+      </w:r>
+      <w:r>
+        <w:rPr/>
+        <w:t>, the feature docs) remain as deep-dives it links.</w:t>
+      </w:r>
+    </w:p>
+    <w:p>
+      <w:pPr>
+        <w:pStyle w:val="ListBullet"/>
+      </w:pPr>
+      <w:r>
+        <w:rPr>
+          <w:b/>
+        </w:rPr>
+        <w:t>Under the hood:</w:t>
+      </w:r>
+      <w:r>
+        <w:rPr/>
+        <w:t xml:space="preserve"> no runtime change. </w:t>
+      </w:r>
+      <w:r>
+        <w:rPr>
+          <w:rFonts w:ascii="Consolas" w:hAnsi="Consolas"/>
+          <w:b w:val="0"/>
+          <w:color w:val="2A4A3A"/>
+          <w:sz w:val="20"/>
+        </w:rPr>
+        <w:t>.md</w:t>
+      </w:r>
+      <w:r>
+        <w:rPr/>
+        <w:t xml:space="preserve"> is the editable source; </w:t>
+      </w:r>
+      <w:r>
+        <w:rPr>
+          <w:rFonts w:ascii="Consolas" w:hAnsi="Consolas"/>
+          <w:b w:val="0"/>
+          <w:color w:val="2A4A3A"/>
+          <w:sz w:val="20"/>
+        </w:rPr>
+        <w:t>.docx</w:t>
+      </w:r>
+      <w:r>
+        <w:rPr/>
+        <w:t xml:space="preserve"> and the four PNGs are generated (</w:t>
+      </w:r>
+      <w:r>
+        <w:rPr>
+          <w:rFonts w:ascii="Consolas" w:hAnsi="Consolas"/>
+          <w:b w:val="0"/>
+          <w:color w:val="2A4A3A"/>
+          <w:sz w:val="20"/>
+        </w:rPr>
+        <w:t>7ad2219</w:t>
+      </w:r>
+      <w:r>
+        <w:rPr/>
+        <w:t>).</w:t>
+      </w:r>
+    </w:p>
+    <w:p>
+      <w:pPr>
+        <w:pStyle w:val="ListBullet"/>
+      </w:pPr>
+      <w:r>
+        <w:rPr>
+          <w:b/>
+        </w:rPr>
+        <w:t>Spec sections updated:</w:t>
+      </w:r>
+      <w:r>
+        <w:rPr/>
+        <w:t xml:space="preserve"> all (initial).</w:t>
+      </w:r>
+    </w:p>
+    <w:p>
+      <w:pPr>
+        <w:pStyle w:val="Heading3"/>
+      </w:pPr>
+      <w:r>
+        <w:rPr>
+          <w:b/>
+          <w:sz w:val="23"/>
+        </w:rPr>
+        <w:t>2026-08-26 — migration 0090 — promoted mail stays gone</w:t>
+      </w:r>
+    </w:p>
+    <w:p>
+      <w:pPr>
+        <w:pStyle w:val="ListBullet"/>
+      </w:pPr>
+      <w:r>
+        <w:rPr>
+          <w:b/>
+        </w:rPr>
+        <w:t>For product:</w:t>
+      </w:r>
+      <w:r>
+        <w:rPr/>
+        <w:t xml:space="preserve"> transactions you already imported can no longer reappear in the review queue when history is re-read (42 already-promoted rows had come back after a backfill was widened 15→90 days).</w:t>
+      </w:r>
+    </w:p>
+    <w:p>
+      <w:pPr>
+        <w:pStyle w:val="ListBullet"/>
+      </w:pPr>
+      <w:r>
+        <w:rPr>
+          <w:b/>
+        </w:rPr>
+        <w:t>Under the hood:</w:t>
+      </w:r>
+      <w:r>
+        <w:rPr/>
+        <w:t xml:space="preserve"> </w:t>
+      </w:r>
+      <w:r>
+        <w:rPr>
+          <w:rFonts w:ascii="Consolas" w:hAnsi="Consolas"/>
+          <w:b w:val="0"/>
+          <w:color w:val="2A4A3A"/>
+          <w:sz w:val="20"/>
+        </w:rPr>
+        <w:t>resolved_email_messages</w:t>
+      </w:r>
+      <w:r>
+        <w:rPr/>
+        <w:t xml:space="preserve"> tombstones — ids only, written </w:t>
+      </w:r>
+      <w:r>
+        <w:rPr>
+          <w:i/>
+        </w:rPr>
+        <w:t>before</w:t>
+      </w:r>
+      <w:r>
+        <w:rPr/>
+        <w:t xml:space="preserve"> the staged-row DELETE; </w:t>
+      </w:r>
+      <w:r>
+        <w:rPr>
+          <w:rFonts w:ascii="Consolas" w:hAnsi="Consolas"/>
+          <w:b w:val="0"/>
+          <w:color w:val="2A4A3A"/>
+          <w:sz w:val="20"/>
+        </w:rPr>
+        <w:t>alreadyStaged</w:t>
+      </w:r>
+      <w:r>
+        <w:rPr/>
+        <w:t xml:space="preserve"> unions them. Re-keyed by </w:t>
+      </w:r>
+      <w:r>
+        <w:rPr>
+          <w:rFonts w:ascii="Consolas" w:hAnsi="Consolas"/>
+          <w:b w:val="0"/>
+          <w:color w:val="2A4A3A"/>
+          <w:sz w:val="20"/>
+        </w:rPr>
+        <w:t>0092</w:t>
+      </w:r>
+      <w:r>
+        <w:rPr/>
+        <w:t xml:space="preserve"> so personal-only users can write them.</w:t>
+      </w:r>
+    </w:p>
+    <w:p>
+      <w:pPr>
+        <w:pStyle w:val="ListBullet"/>
+      </w:pPr>
+      <w:r>
+        <w:rPr>
+          <w:b/>
+        </w:rPr>
+        <w:t>Spec sections updated:</w:t>
+      </w:r>
+      <w:r>
+        <w:rPr/>
+        <w:t xml:space="preserve"> §12.2, §18.1 (this entry predates the doc; recorded for the historical spine).</w:t>
+      </w:r>
+    </w:p>
+    <w:p>
+      <w:pPr>
+        <w:pStyle w:val="Heading3"/>
+      </w:pPr>
+      <w:r>
+        <w:rPr>
+          <w:b/>
+          <w:sz w:val="23"/>
+        </w:rPr>
+        <w:t>2026-08-25 — consent v4 · mail sent to the model as written · connect moves in-house</w:t>
+      </w:r>
+    </w:p>
+    <w:p>
+      <w:pPr>
+        <w:pStyle w:val="ListBullet"/>
+      </w:pPr>
+      <w:r>
+        <w:rPr>
+          <w:b/>
+        </w:rPr>
+        <w:t>For product:</w:t>
+      </w:r>
+      <w:r>
+        <w:rPr/>
+        <w:t xml:space="preserve"> the consent sheet now states plainly that a first-time bank's mail is read by an AI service, amounts and names included — everyone re-affirms (v4). Repeat-sender mail still never leaves the machine. Mailbox connect became a FamilyHub-owned flow instead of the separate Cloud Run API.</w:t>
+      </w:r>
+    </w:p>
+    <w:p>
+      <w:pPr>
+        <w:pStyle w:val="ListBullet"/>
+      </w:pPr>
+      <w:r>
+        <w:rPr>
+          <w:b/>
+        </w:rPr>
+        <w:t>Under the hood:</w:t>
+      </w:r>
+      <w:r>
+        <w:rPr/>
+        <w:t xml:space="preserve"> </w:t>
+      </w:r>
+      <w:r>
+        <w:rPr>
+          <w:rFonts w:ascii="Consolas" w:hAnsi="Consolas"/>
+          <w:b w:val="0"/>
+          <w:color w:val="2A4A3A"/>
+          <w:sz w:val="20"/>
+        </w:rPr>
+        <w:t>maskForSharing()</w:t>
+      </w:r>
+      <w:r>
+        <w:rPr/>
+        <w:t>/</w:t>
+      </w:r>
+      <w:r>
+        <w:rPr>
+          <w:rFonts w:ascii="Consolas" w:hAnsi="Consolas"/>
+          <w:b w:val="0"/>
+          <w:color w:val="2A4A3A"/>
+          <w:sz w:val="20"/>
+        </w:rPr>
+        <w:t>unmaskExtraction()</w:t>
+      </w:r>
+      <w:r>
+        <w:rPr/>
+        <w:t xml:space="preserve"> removed; </w:t>
+      </w:r>
+      <w:r>
+        <w:rPr>
+          <w:rFonts w:ascii="Consolas" w:hAnsi="Consolas"/>
+          <w:b w:val="0"/>
+          <w:color w:val="2A4A3A"/>
+          <w:sz w:val="20"/>
+        </w:rPr>
+        <w:t>FH_CONSENT_V = 4</w:t>
+      </w:r>
+      <w:r>
+        <w:rPr/>
+        <w:t xml:space="preserve">; </w:t>
+      </w:r>
+      <w:r>
+        <w:rPr>
+          <w:rFonts w:ascii="Consolas" w:hAnsi="Consolas"/>
+          <w:b w:val="0"/>
+          <w:color w:val="2A4A3A"/>
+          <w:sz w:val="20"/>
+        </w:rPr>
+        <w:t>mailbox-connect</w:t>
+      </w:r>
+      <w:r>
+        <w:rPr/>
+        <w:t xml:space="preserve"> Edge Function owns authorize/callback and writes </w:t>
+      </w:r>
+      <w:r>
+        <w:rPr>
+          <w:rFonts w:ascii="Consolas" w:hAnsi="Consolas"/>
+          <w:b w:val="0"/>
+          <w:color w:val="2A4A3A"/>
+          <w:sz w:val="20"/>
+        </w:rPr>
+        <w:t>mailbox_grants</w:t>
+      </w:r>
+      <w:r>
+        <w:rPr/>
+        <w:t>; erasure still calls the legacy Cloud Run DELETE to stop its watcher.</w:t>
+      </w:r>
+    </w:p>
+    <w:p>
+      <w:pPr>
+        <w:pStyle w:val="ListBullet"/>
+      </w:pPr>
+      <w:r>
+        <w:rPr>
+          <w:b/>
+        </w:rPr>
+        <w:t>Spec sections updated:</w:t>
+      </w:r>
+      <w:r>
+        <w:rPr/>
+        <w:t xml:space="preserve"> §8, §14.1, §16.3 (recorded retroactively).</w:t>
       </w:r>
     </w:p>
     <w:sectPr>

</xml_diff>

<commit_message>
Release notes: Nợ & cho vay + Tài Chính tab (v444); regenerate effortless spec .docx
In-app "What's new" was stale since v357 — add the Owing & lending feature and
the personal Cá nhân→Tài Chính tab redesign (Wallet-pass per-space cards).
Framed around what works today (manual ledger); email auto-capture left out
while the Gemini quota is degraded. New ICO.swap glyph. sw→v444.

Also regenerates effortless-transaction-logging-spec.docx from the updated
markdown (the Part 3 release-log contract).

Co-Authored-By: Claude Fable 5 <noreply@anthropic.com>
</commit_message>
<xml_diff>
--- a/docs/specs/effortless-transaction-logging-spec.docx
+++ b/docs/specs/effortless-transaction-logging-spec.docx
@@ -28296,6 +28296,80 @@
         <w:rPr>
           <w:b/>
         </w:rPr>
+        <w:t>The Gemini free-tier quota is the throughput ceiling</w:t>
+      </w:r>
+      <w:r>
+        <w:rPr/>
+        <w:t xml:space="preserve"> (live, 2026-09-02). Any mail whose shape has no learned template needs a model call, and the free-tier request quota (per-minute and per-day) is far below one mailbox's first-backfill demand — so the model returns HTTP 429, every model-needing mail is </w:t>
+      </w:r>
+      <w:r>
+        <w:rPr>
+          <w:rFonts w:ascii="Consolas" w:hAnsi="Consolas"/>
+          <w:b w:val="0"/>
+          <w:color w:val="2A4A3A"/>
+          <w:sz w:val="20"/>
+        </w:rPr>
+        <w:t>held</w:t>
+      </w:r>
+      <w:r>
+        <w:rPr/>
+        <w:t xml:space="preserve"> on </w:t>
+      </w:r>
+      <w:r>
+        <w:rPr>
+          <w:rFonts w:ascii="Consolas" w:hAnsi="Consolas"/>
+          <w:b w:val="0"/>
+          <w:color w:val="2A4A3A"/>
+          <w:sz w:val="20"/>
+        </w:rPr>
+        <w:t>LlmUnavailable</w:t>
+      </w:r>
+      <w:r>
+        <w:rPr/>
+        <w:t xml:space="preserve">, and </w:t>
+      </w:r>
+      <w:r>
+        <w:rPr>
+          <w:rFonts w:ascii="Consolas" w:hAnsi="Consolas"/>
+          <w:b w:val="0"/>
+          <w:color w:val="2A4A3A"/>
+          <w:sz w:val="20"/>
+        </w:rPr>
+        <w:t>read_tally.held</w:t>
+      </w:r>
+      <w:r>
+        <w:rPr/>
+        <w:t xml:space="preserve"> runs into the hundreds of thousands per day across grants. The local tiers (junk cache, stored template, label-table) need no quota and are unaffected. Two fix directions, not exclusive: (a) </w:t>
+      </w:r>
+      <w:r>
+        <w:rPr>
+          <w:b/>
+        </w:rPr>
+        <w:t>billing</w:t>
+      </w:r>
+      <w:r>
+        <w:rPr/>
+        <w:t xml:space="preserve"> — a paid Gemini tier is the real unblock; (b) </w:t>
+      </w:r>
+      <w:r>
+        <w:rPr>
+          <w:b/>
+        </w:rPr>
+        <w:t>fewer model calls</w:t>
+      </w:r>
+      <w:r>
+        <w:rPr/>
+        <w:t xml:space="preserve"> — extend the label-table reader to the shapes that currently fall through to the model (VN card-payment confirmations are the observed gap), so the model is a rare last resort, not a per-mailbox dependency. Compounds with the junk-tail item below: a never-finishing backfill keeps re-listing the same model-needing mail and re-spending the quota.</w:t>
+      </w:r>
+    </w:p>
+    <w:p>
+      <w:pPr>
+        <w:pStyle w:val="ListBullet"/>
+      </w:pPr>
+      <w:r>
+        <w:rPr>
+          <w:b/>
+        </w:rPr>
         <w:t>A junk-tailed backfill can never finish</w:t>
       </w:r>
       <w:r>
@@ -29587,6 +29661,635 @@
           <w:sz w:val="28"/>
         </w:rPr>
         <w:t>28. Releases (newest first)</w:t>
+      </w:r>
+    </w:p>
+    <w:p>
+      <w:pPr>
+        <w:pStyle w:val="Heading3"/>
+      </w:pPr>
+      <w:r>
+        <w:rPr>
+          <w:b/>
+          <w:sz w:val="23"/>
+        </w:rPr>
+        <w:t>2026-09-02 — mailbox-sync v27 — logic version reverted (5→4), holds made visible, and the wall behind it all: Gemini free-tier quota</w:t>
+      </w:r>
+    </w:p>
+    <w:p>
+      <w:pPr>
+        <w:pStyle w:val="ListBullet"/>
+      </w:pPr>
+      <w:r>
+        <w:rPr>
+          <w:b/>
+        </w:rPr>
+        <w:t>For product:</w:t>
+      </w:r>
+      <w:r>
+        <w:rPr/>
+        <w:t xml:space="preserve"> why auto-capture went quiet. A mailbox that connected on 2026-09-02 stopped importing new mail — a second credit-card-payment email never reached review. Root cause: the model (Gemini) is returning HTTP 429 "quota exceeded", so every mail that needs a model read is HELD and retried forever rather than staged. The previous day's classifier deploy made it worse by forcing every stored template to re-derive through the model at once. The version bump is undone; the instrument classifier itself stays, filled by a local heuristic that needs no model. </w:t>
+      </w:r>
+      <w:r>
+        <w:rPr>
+          <w:b/>
+        </w:rPr>
+        <w:t>Nothing is lost</w:t>
+      </w:r>
+      <w:r>
+        <w:rPr/>
+        <w:t xml:space="preserve"> — held mail sits in Gmail and re-reads the moment quota returns. </w:t>
+      </w:r>
+      <w:r>
+        <w:rPr>
+          <w:b/>
+        </w:rPr>
+        <w:t>The unblock is billing, not code: the Gemini key needs a paid tier.</w:t>
+      </w:r>
+    </w:p>
+    <w:p>
+      <w:pPr>
+        <w:pStyle w:val="ListBullet"/>
+      </w:pPr>
+      <w:r>
+        <w:rPr>
+          <w:b/>
+        </w:rPr>
+        <w:t>Under the hood:</w:t>
+      </w:r>
+      <w:r>
+        <w:rPr/>
+        <w:t xml:space="preserve"> </w:t>
+      </w:r>
+      <w:r>
+        <w:rPr>
+          <w:rFonts w:ascii="Consolas" w:hAnsi="Consolas"/>
+          <w:b w:val="0"/>
+          <w:color w:val="2A4A3A"/>
+          <w:sz w:val="20"/>
+        </w:rPr>
+        <w:t>EXTRACTION_LOGIC_VERSION</w:t>
+      </w:r>
+      <w:r>
+        <w:rPr/>
+        <w:t xml:space="preserve"> reverted 5→4 in </w:t>
+      </w:r>
+      <w:r>
+        <w:rPr>
+          <w:rFonts w:ascii="Consolas" w:hAnsi="Consolas"/>
+          <w:b w:val="0"/>
+          <w:color w:val="2A4A3A"/>
+          <w:sz w:val="20"/>
+        </w:rPr>
+        <w:t>templates.mjs</w:t>
+      </w:r>
+      <w:r>
+        <w:rPr/>
+        <w:t xml:space="preserve"> + </w:t>
+      </w:r>
+      <w:r>
+        <w:rPr>
+          <w:rFonts w:ascii="Consolas" w:hAnsi="Consolas"/>
+          <w:b w:val="0"/>
+          <w:color w:val="2A4A3A"/>
+          <w:sz w:val="20"/>
+        </w:rPr>
+        <w:t>bank-email-pipeline.gs</w:t>
+      </w:r>
+      <w:r>
+        <w:rPr/>
+        <w:t xml:space="preserve"> (commit </w:t>
+      </w:r>
+      <w:r>
+        <w:rPr>
+          <w:rFonts w:ascii="Consolas" w:hAnsi="Consolas"/>
+          <w:b w:val="0"/>
+          <w:color w:val="2A4A3A"/>
+          <w:sz w:val="20"/>
+        </w:rPr>
+        <w:t>b0d5fdd</w:t>
+      </w:r>
+      <w:r>
+        <w:rPr/>
+        <w:t xml:space="preserve">). The bump to 5 (v26, below) staticised </w:t>
+      </w:r>
+      <w:r>
+        <w:rPr>
+          <w:rFonts w:ascii="Consolas" w:hAnsi="Consolas"/>
+          <w:b w:val="0"/>
+          <w:color w:val="2A4A3A"/>
+          <w:sz w:val="20"/>
+        </w:rPr>
+        <w:t>account_kind</w:t>
+      </w:r>
+      <w:r>
+        <w:rPr/>
+        <w:t xml:space="preserve"> into the template and so invalidated every v4 template — the first backfill under it needed one model call per shape, blew </w:t>
+      </w:r>
+      <w:r>
+        <w:rPr>
+          <w:rFonts w:ascii="Consolas" w:hAnsi="Consolas"/>
+          <w:b w:val="0"/>
+          <w:color w:val="2A4A3A"/>
+          <w:sz w:val="20"/>
+        </w:rPr>
+        <w:t>MAX_MODEL_CALLS_PER_GRANT</w:t>
+      </w:r>
+      <w:r>
+        <w:rPr/>
+        <w:t xml:space="preserve"> (40/run), </w:t>
+      </w:r>
+      <w:r>
+        <w:rPr>
+          <w:rFonts w:ascii="Consolas" w:hAnsi="Consolas"/>
+          <w:b w:val="0"/>
+          <w:color w:val="2A4A3A"/>
+          <w:sz w:val="20"/>
+        </w:rPr>
+        <w:t>held</w:t>
+      </w:r>
+      <w:r>
+        <w:rPr/>
+        <w:t xml:space="preserve"> the excess on </w:t>
+      </w:r>
+      <w:r>
+        <w:rPr>
+          <w:rFonts w:ascii="Consolas" w:hAnsi="Consolas"/>
+          <w:b w:val="0"/>
+          <w:color w:val="2A4A3A"/>
+          <w:sz w:val="20"/>
+        </w:rPr>
+        <w:t>LlmUnavailable</w:t>
+      </w:r>
+      <w:r>
+        <w:rPr/>
+        <w:t xml:space="preserve">, left </w:t>
+      </w:r>
+      <w:r>
+        <w:rPr>
+          <w:rFonts w:ascii="Consolas" w:hAnsi="Consolas"/>
+          <w:b w:val="0"/>
+          <w:color w:val="2A4A3A"/>
+          <w:sz w:val="20"/>
+        </w:rPr>
+        <w:t>backfilled_at</w:t>
+      </w:r>
+      <w:r>
+        <w:rPr/>
+        <w:t xml:space="preserve"> null, and re-read the same window every minute (</w:t>
+      </w:r>
+      <w:r>
+        <w:rPr>
+          <w:rFonts w:ascii="Consolas" w:hAnsi="Consolas"/>
+          <w:b w:val="0"/>
+          <w:color w:val="2A4A3A"/>
+          <w:sz w:val="20"/>
+        </w:rPr>
+        <w:t>stalled_runs</w:t>
+      </w:r>
+      <w:r>
+        <w:rPr/>
+        <w:t xml:space="preserve"> 21→33). No bump was needed: </w:t>
+      </w:r>
+      <w:r>
+        <w:rPr>
+          <w:rFonts w:ascii="Consolas" w:hAnsi="Consolas"/>
+          <w:b w:val="0"/>
+          <w:color w:val="2A4A3A"/>
+          <w:sz w:val="20"/>
+        </w:rPr>
+        <w:t>_fillAccountKind</w:t>
+      </w:r>
+      <w:r>
+        <w:rPr/>
+        <w:t xml:space="preserve"> runs the heuristic on EVERY tier including template reads, so the field is populated without freezing it. Also — the worker's hold-catch (</w:t>
+      </w:r>
+      <w:r>
+        <w:rPr>
+          <w:rFonts w:ascii="Consolas" w:hAnsi="Consolas"/>
+          <w:b w:val="0"/>
+          <w:color w:val="2A4A3A"/>
+          <w:sz w:val="20"/>
+        </w:rPr>
+        <w:t>worker.mjs</w:t>
+      </w:r>
+      <w:r>
+        <w:rPr/>
+        <w:t xml:space="preserve">) now </w:t>
+      </w:r>
+      <w:r>
+        <w:rPr>
+          <w:rFonts w:ascii="Consolas" w:hAnsi="Consolas"/>
+          <w:b w:val="0"/>
+          <w:color w:val="2A4A3A"/>
+          <w:sz w:val="20"/>
+        </w:rPr>
+        <w:t>console.error</w:t>
+      </w:r>
+      <w:r>
+        <w:rPr/>
+        <w:t xml:space="preserve">s the real exception; it had swallowed every </w:t>
+      </w:r>
+      <w:r>
+        <w:rPr>
+          <w:rFonts w:ascii="Consolas" w:hAnsi="Consolas"/>
+          <w:b w:val="0"/>
+          <w:color w:val="2A4A3A"/>
+          <w:sz w:val="20"/>
+        </w:rPr>
+        <w:t>readTransaction</w:t>
+      </w:r>
+      <w:r>
+        <w:rPr/>
+        <w:t xml:space="preserve"> throw as a generic model-hold, which is exactly why the stall was invisible in the logs until this deploy surfaced the 429. </w:t>
+      </w:r>
+      <w:r>
+        <w:rPr>
+          <w:rFonts w:ascii="Consolas" w:hAnsi="Consolas"/>
+          <w:b w:val="0"/>
+          <w:color w:val="2A4A3A"/>
+          <w:sz w:val="20"/>
+        </w:rPr>
+        <w:t>read_tally</w:t>
+      </w:r>
+      <w:r>
+        <w:rPr/>
+        <w:t xml:space="preserve"> shows </w:t>
+      </w:r>
+      <w:r>
+        <w:rPr>
+          <w:rFonts w:ascii="Consolas" w:hAnsi="Consolas"/>
+          <w:b w:val="0"/>
+          <w:color w:val="2A4A3A"/>
+          <w:sz w:val="20"/>
+        </w:rPr>
+        <w:t>held</w:t>
+      </w:r>
+      <w:r>
+        <w:rPr/>
+        <w:t xml:space="preserve"> in the hundreds of thousands per day across all grants — the quota wall is chronic, not new.</w:t>
+      </w:r>
+    </w:p>
+    <w:p>
+      <w:pPr>
+        <w:pStyle w:val="ListBullet"/>
+      </w:pPr>
+      <w:r>
+        <w:rPr>
+          <w:b/>
+        </w:rPr>
+        <w:t>Spec sections updated:</w:t>
+      </w:r>
+      <w:r>
+        <w:rPr/>
+        <w:t xml:space="preserve"> §16 (extraction — </w:t>
+      </w:r>
+      <w:r>
+        <w:rPr>
+          <w:rFonts w:ascii="Consolas" w:hAnsi="Consolas"/>
+          <w:b w:val="0"/>
+          <w:color w:val="2A4A3A"/>
+          <w:sz w:val="20"/>
+        </w:rPr>
+        <w:t>account_kind</w:t>
+      </w:r>
+      <w:r>
+        <w:rPr/>
+        <w:t xml:space="preserve"> is heuristic-filled, not version-gated); §24 (Gemini free-tier quota added as a live limit).</w:t>
+      </w:r>
+    </w:p>
+    <w:p>
+      <w:pPr>
+        <w:pStyle w:val="ListBullet"/>
+      </w:pPr>
+      <w:r>
+        <w:rPr>
+          <w:b/>
+        </w:rPr>
+        <w:t>Watch for:</w:t>
+      </w:r>
+      <w:r>
+        <w:rPr/>
+        <w:t xml:space="preserve"> the live wall is the </w:t>
+      </w:r>
+      <w:r>
+        <w:rPr>
+          <w:b/>
+        </w:rPr>
+        <w:t>Gemini free-tier request quota</w:t>
+      </w:r>
+      <w:r>
+        <w:rPr/>
+        <w:t xml:space="preserve">. Until the key is on a paid tier, any mail whose shape has no learned template (most VN card-payment confirmations) is held on 429; the local tiers (junk cache, stored template, label-table) need no quota and keep working. </w:t>
+      </w:r>
+      <w:r>
+        <w:rPr>
+          <w:b/>
+        </w:rPr>
+        <w:t>Do NOT reset-and-reconnect a mailbox while quota is dead</w:t>
+      </w:r>
+      <w:r>
+        <w:rPr/>
+        <w:t xml:space="preserve"> — a fresh backfill re-hits 429 and re-stalls. Efficiency (fewer model calls per mailbox — e.g. teaching the label-table reader VIB's payment-confirmation format) is being investigated separately.</w:t>
+      </w:r>
+    </w:p>
+    <w:p>
+      <w:pPr>
+        <w:pStyle w:val="Heading3"/>
+      </w:pPr>
+      <w:r>
+        <w:rPr>
+          <w:b/>
+          <w:sz w:val="23"/>
+        </w:rPr>
+        <w:t>2026-09-01 — mailbox-sync v26 — the instrument classifier (</w:t>
+      </w:r>
+      <w:r>
+        <w:rPr>
+          <w:rFonts w:ascii="Consolas" w:hAnsi="Consolas"/>
+          <w:b w:val="0"/>
+          <w:color w:val="2A4A3A"/>
+          <w:sz w:val="21"/>
+        </w:rPr>
+        <w:t>account_kind</w:t>
+      </w:r>
+      <w:r>
+        <w:rPr>
+          <w:b/>
+          <w:sz w:val="23"/>
+        </w:rPr>
+        <w:t>)</w:t>
+      </w:r>
+    </w:p>
+    <w:p>
+      <w:pPr>
+        <w:pStyle w:val="ListBullet"/>
+      </w:pPr>
+      <w:r>
+        <w:rPr>
+          <w:b/>
+        </w:rPr>
+        <w:t>For product:</w:t>
+      </w:r>
+      <w:r>
+        <w:rPr/>
+        <w:t xml:space="preserve"> captured rows now carry WHICH instrument moved the money — credit card, bank account, or e-wallet. It is what the new "Nợ &amp; cho vay" (borrowing &amp; lending) feature needs to build a card's balance and to tell a card </w:t>
+      </w:r>
+      <w:r>
+        <w:rPr>
+          <w:i/>
+        </w:rPr>
+        <w:t>payment</w:t>
+      </w:r>
+      <w:r>
+        <w:rPr/>
+        <w:t xml:space="preserve"> (a transfer) from a card </w:t>
+      </w:r>
+      <w:r>
+        <w:rPr>
+          <w:i/>
+        </w:rPr>
+        <w:t>purchase</w:t>
+      </w:r>
+      <w:r>
+        <w:rPr/>
+        <w:t xml:space="preserve"> (a spend). Shown as a quiet chip on the review card ("VIB · tín dụng ••1234").</w:t>
+      </w:r>
+    </w:p>
+    <w:p>
+      <w:pPr>
+        <w:pStyle w:val="ListBullet"/>
+      </w:pPr>
+      <w:r>
+        <w:rPr>
+          <w:b/>
+        </w:rPr>
+        <w:t>Under the hood:</w:t>
+      </w:r>
+      <w:r>
+        <w:rPr/>
+        <w:t xml:space="preserve"> </w:t>
+      </w:r>
+      <w:r>
+        <w:rPr>
+          <w:rFonts w:ascii="Consolas" w:hAnsi="Consolas"/>
+          <w:b w:val="0"/>
+          <w:color w:val="2A4A3A"/>
+          <w:sz w:val="20"/>
+        </w:rPr>
+        <w:t>deriveAccountKind</w:t>
+      </w:r>
+      <w:r>
+        <w:rPr/>
+        <w:t xml:space="preserve"> (spec §8.2 signals: hạn mức/dư nợ → credit_card, số dư → deposit, ví providers → ewallet, else null) added to the shared extraction slice, byte-identical in </w:t>
+      </w:r>
+      <w:r>
+        <w:rPr>
+          <w:rFonts w:ascii="Consolas" w:hAnsi="Consolas"/>
+          <w:b w:val="0"/>
+          <w:color w:val="2A4A3A"/>
+          <w:sz w:val="20"/>
+        </w:rPr>
+        <w:t>templates.mjs</w:t>
+      </w:r>
+      <w:r>
+        <w:rPr/>
+        <w:t xml:space="preserve"> and </w:t>
+      </w:r>
+      <w:r>
+        <w:rPr>
+          <w:rFonts w:ascii="Consolas" w:hAnsi="Consolas"/>
+          <w:b w:val="0"/>
+          <w:color w:val="2A4A3A"/>
+          <w:sz w:val="20"/>
+        </w:rPr>
+        <w:t>bank-email-pipeline.gs</w:t>
+      </w:r>
+      <w:r>
+        <w:rPr/>
+        <w:t xml:space="preserve">; wired into all three tiers via </w:t>
+      </w:r>
+      <w:r>
+        <w:rPr>
+          <w:rFonts w:ascii="Consolas" w:hAnsi="Consolas"/>
+          <w:b w:val="0"/>
+          <w:color w:val="2A4A3A"/>
+          <w:sz w:val="20"/>
+        </w:rPr>
+        <w:t>_fillAccountKind</w:t>
+      </w:r>
+      <w:r>
+        <w:rPr/>
+        <w:t xml:space="preserve"> (</w:t>
+      </w:r>
+      <w:r>
+        <w:rPr>
+          <w:rFonts w:ascii="Consolas" w:hAnsi="Consolas"/>
+          <w:b w:val="0"/>
+          <w:color w:val="2A4A3A"/>
+          <w:sz w:val="20"/>
+        </w:rPr>
+        <w:t>extract.mjs</w:t>
+      </w:r>
+      <w:r>
+        <w:rPr/>
+        <w:t xml:space="preserve">); the LLM schema gained a nullable </w:t>
+      </w:r>
+      <w:r>
+        <w:rPr>
+          <w:rFonts w:ascii="Consolas" w:hAnsi="Consolas"/>
+          <w:b w:val="0"/>
+          <w:color w:val="2A4A3A"/>
+          <w:sz w:val="20"/>
+        </w:rPr>
+        <w:t>account_kind</w:t>
+      </w:r>
+      <w:r>
+        <w:rPr/>
+        <w:t xml:space="preserve"> enum (</w:t>
+      </w:r>
+      <w:r>
+        <w:rPr>
+          <w:rFonts w:ascii="Consolas" w:hAnsi="Consolas"/>
+          <w:b w:val="0"/>
+          <w:color w:val="2A4A3A"/>
+          <w:sz w:val="20"/>
+        </w:rPr>
+        <w:t>llm.mjs</w:t>
+      </w:r>
+      <w:r>
+        <w:rPr/>
+        <w:t xml:space="preserve">); threaded </w:t>
+      </w:r>
+      <w:r>
+        <w:rPr>
+          <w:rFonts w:ascii="Consolas" w:hAnsi="Consolas"/>
+          <w:b w:val="0"/>
+          <w:color w:val="2A4A3A"/>
+          <w:sz w:val="20"/>
+        </w:rPr>
+        <w:t>_toReading</w:t>
+      </w:r>
+      <w:r>
+        <w:rPr/>
+        <w:t xml:space="preserve"> → </w:t>
+      </w:r>
+      <w:r>
+        <w:rPr>
+          <w:rFonts w:ascii="Consolas" w:hAnsi="Consolas"/>
+          <w:b w:val="0"/>
+          <w:color w:val="2A4A3A"/>
+          <w:sz w:val="20"/>
+        </w:rPr>
+        <w:t>normaliseReading</w:t>
+      </w:r>
+      <w:r>
+        <w:rPr/>
+        <w:t xml:space="preserve"> → sealed INSIDE </w:t>
+      </w:r>
+      <w:r>
+        <w:rPr>
+          <w:rFonts w:ascii="Consolas" w:hAnsi="Consolas"/>
+          <w:b w:val="0"/>
+          <w:color w:val="2A4A3A"/>
+          <w:sz w:val="20"/>
+        </w:rPr>
+        <w:t>raw_extracted</w:t>
+      </w:r>
+      <w:r>
+        <w:rPr/>
+        <w:t xml:space="preserve"> (never a top-level column, so </w:t>
+      </w:r>
+      <w:r>
+        <w:rPr>
+          <w:rFonts w:ascii="Consolas" w:hAnsi="Consolas"/>
+          <w:b w:val="0"/>
+          <w:color w:val="2A4A3A"/>
+          <w:sz w:val="20"/>
+        </w:rPr>
+        <w:t>sealing.test.js</w:t>
+      </w:r>
+      <w:r>
+        <w:rPr/>
+        <w:t xml:space="preserve"> and 0068's CHECK are untouched). New </w:t>
+      </w:r>
+      <w:r>
+        <w:rPr>
+          <w:rFonts w:ascii="Consolas" w:hAnsi="Consolas"/>
+          <w:b w:val="0"/>
+          <w:color w:val="2A4A3A"/>
+          <w:sz w:val="20"/>
+        </w:rPr>
+        <w:t>pipeline/account-kind.test.js</w:t>
+      </w:r>
+      <w:r>
+        <w:rPr/>
+        <w:t xml:space="preserve">. This deploy also bumped </w:t>
+      </w:r>
+      <w:r>
+        <w:rPr>
+          <w:rFonts w:ascii="Consolas" w:hAnsi="Consolas"/>
+          <w:b w:val="0"/>
+          <w:color w:val="2A4A3A"/>
+          <w:sz w:val="20"/>
+        </w:rPr>
+        <w:t>EXTRACTION_LOGIC_VERSION</w:t>
+      </w:r>
+      <w:r>
+        <w:rPr/>
+        <w:t xml:space="preserve"> 4→5 to staticise the field — </w:t>
+      </w:r>
+      <w:r>
+        <w:rPr>
+          <w:b/>
+        </w:rPr>
+        <w:t>reverted the next day (v27, above)</w:t>
+      </w:r>
+      <w:r>
+        <w:rPr/>
+        <w:t xml:space="preserve"> after it stalled a backfill. Treat v26 + v27 as one landing: the classifier stays, the version bump does not.</w:t>
+      </w:r>
+    </w:p>
+    <w:p>
+      <w:pPr>
+        <w:pStyle w:val="ListBullet"/>
+      </w:pPr>
+      <w:r>
+        <w:rPr>
+          <w:b/>
+        </w:rPr>
+        <w:t>Spec sections updated:</w:t>
+      </w:r>
+      <w:r>
+        <w:rPr/>
+        <w:t xml:space="preserve"> §8 (the instrument classifier — new); §16 (extraction cascade fills </w:t>
+      </w:r>
+      <w:r>
+        <w:rPr>
+          <w:rFonts w:ascii="Consolas" w:hAnsi="Consolas"/>
+          <w:b w:val="0"/>
+          <w:color w:val="2A4A3A"/>
+          <w:sz w:val="20"/>
+        </w:rPr>
+        <w:t>account_kind</w:t>
+      </w:r>
+      <w:r>
+        <w:rPr/>
+        <w:t>).</w:t>
+      </w:r>
+    </w:p>
+    <w:p>
+      <w:pPr>
+        <w:pStyle w:val="ListBullet"/>
+      </w:pPr>
+      <w:r>
+        <w:rPr>
+          <w:b/>
+        </w:rPr>
+        <w:t>Watch for:</w:t>
+      </w:r>
+      <w:r>
+        <w:rPr/>
+        <w:t xml:space="preserve"> see v27 — the classifier is inert on model-needing mail while the Gemini quota is exhausted, but the heuristic still tags anything the local tiers can read.</w:t>
       </w:r>
     </w:p>
     <w:p>

</xml_diff>